<commit_message>
Docs: Fix repo references in onboarding Word doc
Updated the .docx onboarding guide to match ONBOARDING.md: repo is now
sfxconwurah/seamfix-dashboard (was the stale seamfix/finance-dashboard).
Edited the document XML in place to preserve formatting.

Co-Authored-By: Claude Opus 4.8 (1M context) <noreply@anthropic.com>
</commit_message>
<xml_diff>
--- a/Seamfix Dashboard - Onboarding Guide.docx
+++ b/Seamfix Dashboard - Onboarding Guide.docx
@@ -132,7 +132,7 @@
           <w:sz w:val="20"/>
           <w:szCs w:val="20"/>
         </w:rPr>
-        <w:t xml:space="preserve">https://github.com/seamfix/finance-dashboard</w:t>
+        <w:t xml:space="preserve">https://github.com/sfxconwurah/seamfix-dashboard</w:t>
       </w:r>
     </w:p>
     <w:p>
@@ -339,7 +339,7 @@
           <w:sz w:val="22"/>
           <w:szCs w:val="22"/>
         </w:rPr>
-        <w:t xml:space="preserve">with access to the seamfix/finance-dashboard repository. Ask your IT admin or Chibuzor to add you as a collaborator.</w:t>
+        <w:t xml:space="preserve">with access to the sfxconwurah/seamfix-dashboard repository. Ask your IT admin or Chibuzor to add you as a collaborator.</w:t>
       </w:r>
     </w:p>
     <w:p>
@@ -480,7 +480,7 @@
           <w:sz w:val="20"/>
           <w:szCs w:val="20"/>
         </w:rPr>
-        <w:t xml:space="preserve">git clone git@github.com:seamfix/finance-dashboard.git</w:t>
+        <w:t xml:space="preserve">git clone git@github.com:sfxconwurah/seamfix-dashboard.git</w:t>
       </w:r>
     </w:p>
     <w:p>
@@ -495,7 +495,7 @@
           <w:sz w:val="20"/>
           <w:szCs w:val="20"/>
         </w:rPr>
-        <w:t xml:space="preserve">cd finance-dashboard</w:t>
+        <w:t xml:space="preserve">cd seamfix-dashboard</w:t>
       </w:r>
     </w:p>
     <w:p>
@@ -532,7 +532,7 @@
           <w:sz w:val="22"/>
           <w:szCs w:val="22"/>
         </w:rPr>
-        <w:t xml:space="preserve">In Claude Desktop’s Cowork mode, click “Select folder” and choose the finance-dashboard folder you just cloned. Claude will automatically read CLAUDE.md to understand the entire project.</w:t>
+        <w:t xml:space="preserve">In Claude Desktop’s Cowork mode, click “Select folder” and choose the seamfix-dashboard folder you just cloned. Claude will automatically read CLAUDE.md to understand the entire project.</w:t>
       </w:r>
     </w:p>
     <w:p>

</xml_diff>

<commit_message>
Docs: Add plain-English basics to onboarding; recommend Claude Code over Cowork
Ahead of onboarding the non-technical Head of Finance:
- Add a 'Brand-New to All This?' section explaining GitHub, repo, clone,
  Streamlit, the terminal, git/commit/push, and CLAUDE.md in simple sentences,
  so a complete newcomer understands the system before the setup steps.
- Switch recommended tool from Cowork to Claude Code (both in the desktop app)
  because Claude Code's usage limits are more generous — Cowork hits limits
  faster. Updated all setup steps/references with a note explaining why.
- Applied to both ONBOARDING.md and the Word .docx (in-place XML edit to
  preserve formatting).

Co-Authored-By: Claude Opus 4.8 (1M context) <noreply@anthropic.com>
</commit_message>
<xml_diff>
--- a/Seamfix Dashboard - Onboarding Guide.docx
+++ b/Seamfix Dashboard - Onboarding Guide.docx
@@ -177,6 +177,284 @@
         <w:pStyle w:val="Heading1"/>
       </w:pPr>
       <w:r>
+        <w:t xml:space="preserve">Brand-New to All This? Read This First</w:t>
+      </w:r>
+    </w:p>
+    <w:p>
+      <w:pPr>
+        <w:spacing w:after="200"/>
+      </w:pPr>
+      <w:r>
+        <w:rPr>
+          <w:rFonts w:ascii="Arial" w:cs="Arial" w:eastAsia="Arial" w:hAnsi="Arial"/>
+          <w:sz w:val="22"/>
+          <w:szCs w:val="22"/>
+        </w:rPr>
+        <w:t xml:space="preserve">If words like “GitHub,” “repo,” or “Streamlit” are new to you, don’t worry — you don’t need to be a programmer to maintain this dashboard. Here is everything explained in simple sentences. Read this once and the rest of the guide will make sense.</w:t>
+      </w:r>
+    </w:p>
+    <w:p>
+      <w:pPr>
+        <w:spacing w:after="60"/>
+      </w:pPr>
+      <w:r>
+        <w:rPr>
+          <w:rFonts w:ascii="Arial" w:cs="Arial" w:eastAsia="Arial" w:hAnsi="Arial"/>
+          <w:b/>
+          <w:bCs/>
+          <w:sz w:val="22"/>
+          <w:szCs w:val="22"/>
+        </w:rPr>
+        <w:t xml:space="preserve">What is the dashboard, really?</w:t>
+      </w:r>
+    </w:p>
+    <w:p>
+      <w:pPr>
+        <w:spacing w:after="200"/>
+      </w:pPr>
+      <w:r>
+        <w:rPr>
+          <w:rFonts w:ascii="Arial" w:cs="Arial" w:eastAsia="Arial" w:hAnsi="Arial"/>
+          <w:sz w:val="22"/>
+          <w:szCs w:val="22"/>
+        </w:rPr>
+        <w:t xml:space="preserve">It’s a website (https://seamfix-executive-dashboard.streamlit.app) that shows Seamfix’s financial health in charts and tables. The charts are not drawn by hand — a small program reads the company’s Excel files and Google Sheet and builds the charts automatically.</w:t>
+      </w:r>
+    </w:p>
+    <w:p>
+      <w:pPr>
+        <w:spacing w:after="60"/>
+      </w:pPr>
+      <w:r>
+        <w:rPr>
+          <w:rFonts w:ascii="Arial" w:cs="Arial" w:eastAsia="Arial" w:hAnsi="Arial"/>
+          <w:b/>
+          <w:bCs/>
+          <w:sz w:val="22"/>
+          <w:szCs w:val="22"/>
+        </w:rPr>
+        <w:t xml:space="preserve">What is GitHub?</w:t>
+      </w:r>
+    </w:p>
+    <w:p>
+      <w:pPr>
+        <w:spacing w:after="200"/>
+      </w:pPr>
+      <w:r>
+        <w:rPr>
+          <w:rFonts w:ascii="Arial" w:cs="Arial" w:eastAsia="Arial" w:hAnsi="Arial"/>
+          <w:sz w:val="22"/>
+          <w:szCs w:val="22"/>
+        </w:rPr>
+        <w:t xml:space="preserve">Think of GitHub as a shared online folder (like Google Drive) — but specifically for the code that builds the dashboard. It stores the latest version of every file and keeps a full history of every change ever made. We keep the code there so it’s safe, backed up, and so the live website knows where to get its instructions. The address of our folder on GitHub is called the repo (short for “repository”): https://github.com/sfxconwurah/seamfix-dashboard</w:t>
+      </w:r>
+    </w:p>
+    <w:p>
+      <w:pPr>
+        <w:spacing w:after="60"/>
+      </w:pPr>
+      <w:r>
+        <w:rPr>
+          <w:rFonts w:ascii="Arial" w:cs="Arial" w:eastAsia="Arial" w:hAnsi="Arial"/>
+          <w:b/>
+          <w:bCs/>
+          <w:sz w:val="22"/>
+          <w:szCs w:val="22"/>
+        </w:rPr>
+        <w:t xml:space="preserve">What does “clone” mean?</w:t>
+      </w:r>
+    </w:p>
+    <w:p>
+      <w:pPr>
+        <w:spacing w:after="200"/>
+      </w:pPr>
+      <w:r>
+        <w:rPr>
+          <w:rFonts w:ascii="Arial" w:cs="Arial" w:eastAsia="Arial" w:hAnsi="Arial"/>
+          <w:sz w:val="22"/>
+          <w:szCs w:val="22"/>
+        </w:rPr>
+        <w:t xml:space="preserve">Cloning is just downloading a copy of that GitHub folder onto your own computer so you can work on it. You do this once.</w:t>
+      </w:r>
+    </w:p>
+    <w:p>
+      <w:pPr>
+        <w:spacing w:after="60"/>
+      </w:pPr>
+      <w:r>
+        <w:rPr>
+          <w:rFonts w:ascii="Arial" w:cs="Arial" w:eastAsia="Arial" w:hAnsi="Arial"/>
+          <w:b/>
+          <w:bCs/>
+          <w:sz w:val="22"/>
+          <w:szCs w:val="22"/>
+        </w:rPr>
+        <w:t xml:space="preserve">What is Streamlit?</w:t>
+      </w:r>
+    </w:p>
+    <w:p>
+      <w:pPr>
+        <w:spacing w:after="200"/>
+      </w:pPr>
+      <w:r>
+        <w:rPr>
+          <w:rFonts w:ascii="Arial" w:cs="Arial" w:eastAsia="Arial" w:hAnsi="Arial"/>
+          <w:sz w:val="22"/>
+          <w:szCs w:val="22"/>
+        </w:rPr>
+        <w:t xml:space="preserve">Streamlit is the service that hosts the live website. It takes the code from GitHub and turns it into the web page your colleagues open in their browser. When people say “the live app,” they mean the Streamlit website. Streamlit re-reads the code from GitHub whenever the app is restarted (“rebooted”).</w:t>
+      </w:r>
+    </w:p>
+    <w:p>
+      <w:pPr>
+        <w:spacing w:after="60"/>
+      </w:pPr>
+      <w:r>
+        <w:rPr>
+          <w:rFonts w:ascii="Arial" w:cs="Arial" w:eastAsia="Arial" w:hAnsi="Arial"/>
+          <w:b/>
+          <w:bCs/>
+          <w:sz w:val="22"/>
+          <w:szCs w:val="22"/>
+        </w:rPr>
+        <w:t xml:space="preserve">What is the terminal?</w:t>
+      </w:r>
+    </w:p>
+    <w:p>
+      <w:pPr>
+        <w:spacing w:after="200"/>
+      </w:pPr>
+      <w:r>
+        <w:rPr>
+          <w:rFonts w:ascii="Arial" w:cs="Arial" w:eastAsia="Arial" w:hAnsi="Arial"/>
+          <w:sz w:val="22"/>
+          <w:szCs w:val="22"/>
+        </w:rPr>
+        <w:t xml:space="preserve">The terminal is a plain text window where you type commands instead of clicking buttons (on Mac it’s the “Terminal” app). You’ll only need it a couple of times for one-time setup. Claude can run most commands for you, so don’t be intimidated by it.</w:t>
+      </w:r>
+    </w:p>
+    <w:p>
+      <w:pPr>
+        <w:spacing w:after="60"/>
+      </w:pPr>
+      <w:r>
+        <w:rPr>
+          <w:rFonts w:ascii="Arial" w:cs="Arial" w:eastAsia="Arial" w:hAnsi="Arial"/>
+          <w:b/>
+          <w:bCs/>
+          <w:sz w:val="22"/>
+          <w:szCs w:val="22"/>
+        </w:rPr>
+        <w:t xml:space="preserve">What is git, commit, and push?</w:t>
+      </w:r>
+    </w:p>
+    <w:p>
+      <w:pPr>
+        <w:spacing w:after="200"/>
+      </w:pPr>
+      <w:r>
+        <w:rPr>
+          <w:rFonts w:ascii="Arial" w:cs="Arial" w:eastAsia="Arial" w:hAnsi="Arial"/>
+          <w:sz w:val="22"/>
+          <w:szCs w:val="22"/>
+        </w:rPr>
+        <w:t xml:space="preserve">git is the tool that tracks changes to the code. A commit is a saved snapshot of your changes, with a short note describing what you did. Pushing means uploading your commits from your computer up to GitHub, so the live site can pick them up. In short: edit, then commit, then push, then reboot.</w:t>
+      </w:r>
+    </w:p>
+    <w:p>
+      <w:pPr>
+        <w:spacing w:after="60"/>
+      </w:pPr>
+      <w:r>
+        <w:rPr>
+          <w:rFonts w:ascii="Arial" w:cs="Arial" w:eastAsia="Arial" w:hAnsi="Arial"/>
+          <w:b/>
+          <w:bCs/>
+          <w:sz w:val="22"/>
+          <w:szCs w:val="22"/>
+        </w:rPr>
+        <w:t xml:space="preserve">What is CLAUDE.md?</w:t>
+      </w:r>
+    </w:p>
+    <w:p>
+      <w:pPr>
+        <w:spacing w:after="200"/>
+      </w:pPr>
+      <w:r>
+        <w:rPr>
+          <w:rFonts w:ascii="Arial" w:cs="Arial" w:eastAsia="Arial" w:hAnsi="Arial"/>
+          <w:sz w:val="22"/>
+          <w:szCs w:val="22"/>
+        </w:rPr>
+        <w:t xml:space="preserve">It’s a file in the project that explains the whole system to Claude in detail — how the data flows, what every column means, and lessons learned. When you point Claude at the project folder, it reads this file automatically so it already understands the project. You generally don’t need to read it yourself, but it’s there if you’re curious. (This onboarding guide is the friendly version; CLAUDE.md is the deep technical version.)</w:t>
+      </w:r>
+    </w:p>
+    <w:p>
+      <w:pPr>
+        <w:spacing w:after="60"/>
+      </w:pPr>
+      <w:r>
+        <w:rPr>
+          <w:rFonts w:ascii="Arial" w:cs="Arial" w:eastAsia="Arial" w:hAnsi="Arial"/>
+          <w:b/>
+          <w:bCs/>
+          <w:sz w:val="22"/>
+          <w:szCs w:val="22"/>
+        </w:rPr>
+        <w:t xml:space="preserve">Claude Code vs Cowork — which do I use?</w:t>
+      </w:r>
+    </w:p>
+    <w:p>
+      <w:pPr>
+        <w:spacing w:after="200"/>
+      </w:pPr>
+      <w:r>
+        <w:rPr>
+          <w:rFonts w:ascii="Arial" w:cs="Arial" w:eastAsia="Arial" w:hAnsi="Arial"/>
+          <w:sz w:val="22"/>
+          <w:szCs w:val="22"/>
+        </w:rPr>
+        <w:t xml:space="preserve">Inside the Claude desktop app there are two ways to let Claude work on files: “Cowork” and “Claude Code.” Use Claude Code. It does the same job — reads the project, edits files, runs tests — but its usage limits are more generous, so you’re less likely to get cut off mid-task. (Both live in the same desktop app; this guide assumes Claude Code.)</w:t>
+      </w:r>
+    </w:p>
+    <w:p>
+      <w:pPr>
+        <w:spacing w:after="60"/>
+      </w:pPr>
+      <w:r>
+        <w:rPr>
+          <w:rFonts w:ascii="Arial" w:cs="Arial" w:eastAsia="Arial" w:hAnsi="Arial"/>
+          <w:b/>
+          <w:bCs/>
+          <w:sz w:val="22"/>
+          <w:szCs w:val="22"/>
+        </w:rPr>
+        <w:t xml:space="preserve">The big picture in one line</w:t>
+      </w:r>
+    </w:p>
+    <w:p>
+      <w:pPr>
+        <w:spacing w:after="200"/>
+      </w:pPr>
+      <w:r>
+        <w:rPr>
+          <w:rFonts w:ascii="Arial" w:cs="Arial" w:eastAsia="Arial" w:hAnsi="Arial"/>
+          <w:sz w:val="22"/>
+          <w:szCs w:val="22"/>
+        </w:rPr>
+        <w:t xml:space="preserve">The Excel/Google Sheet data lives in the cloud, the code on GitHub turns it into charts, Streamlit shows those charts as a website, and when you want to change how it works, you ask Claude Code to edit the code, then push it to GitHub and reboot Streamlit.</w:t>
+      </w:r>
+    </w:p>
+    <w:p>
+      <w:r>
+        <w:br w:type="page"/>
+      </w:r>
+    </w:p>
+    <w:p>
+      <w:pPr>
+        <w:pStyle w:val="Heading1"/>
+      </w:pPr>
+      <w:r>
         <w:t xml:space="preserve">What This Project Is</w:t>
       </w:r>
     </w:p>
@@ -394,7 +672,7 @@
           <w:sz w:val="22"/>
           <w:szCs w:val="22"/>
         </w:rPr>
-        <w:t xml:space="preserve">installed on your computer. Download from https://claude.ai/download. You need the desktop app (not just the website) because it includes Cowork mode, which can edit files and run code.</w:t>
+        <w:t xml:space="preserve">installed on your computer. Download from https://claude.ai/download. You need the desktop app (not just the website) because it includes Claude Code, which can edit files and run code on your computer. (The desktop app also has Cowork — we use Claude Code instead because its usage limits are more generous.)</w:t>
       </w:r>
     </w:p>
     <w:p>
@@ -431,20 +709,20 @@
         <w:pStyle w:val="Heading2"/>
       </w:pPr>
       <w:r>
-        <w:t xml:space="preserve">Step 2: Enable Cowork Mode</w:t>
-      </w:r>
-    </w:p>
-    <w:p>
-      <w:pPr>
-        <w:spacing w:after="200"/>
-      </w:pPr>
-      <w:r>
-        <w:rPr>
-          <w:rFonts w:ascii="Arial" w:cs="Arial" w:eastAsia="Arial" w:hAnsi="Arial"/>
-          <w:sz w:val="22"/>
-          <w:szCs w:val="22"/>
-        </w:rPr>
-        <w:t xml:space="preserve">In Claude Desktop, look for “Cowork” in the sidebar or settings. Enable it. This gives Claude the ability to read and write files and run commands on your computer in a secure sandbox.</w:t>
+        <w:t xml:space="preserve">Step 2: Open Claude Code</w:t>
+      </w:r>
+    </w:p>
+    <w:p>
+      <w:pPr>
+        <w:spacing w:after="200"/>
+      </w:pPr>
+      <w:r>
+        <w:rPr>
+          <w:rFonts w:ascii="Arial" w:cs="Arial" w:eastAsia="Arial" w:hAnsi="Arial"/>
+          <w:sz w:val="22"/>
+          <w:szCs w:val="22"/>
+        </w:rPr>
+        <w:t xml:space="preserve">In Claude Desktop, open Claude Code (look for it in the sidebar or settings). This is the mode that gives Claude the ability to read and write files and run commands on your computer. Use Claude Code rather than Cowork — same capabilities, but Claude Code’s usage limits are more generous, so you won’t get cut off as quickly.</w:t>
       </w:r>
     </w:p>
     <w:p>
@@ -532,7 +810,7 @@
           <w:sz w:val="22"/>
           <w:szCs w:val="22"/>
         </w:rPr>
-        <w:t xml:space="preserve">In Claude Desktop’s Cowork mode, click “Select folder” and choose the seamfix-dashboard folder you just cloned. Claude will automatically read CLAUDE.md to understand the entire project.</w:t>
+        <w:t xml:space="preserve">In Claude Code, select the seamfix-dashboard folder you just cloned as the working folder. Claude will automatically read CLAUDE.md to understand the entire project.</w:t>
       </w:r>
     </w:p>
     <w:p>
@@ -579,7 +857,7 @@
           <w:sz w:val="22"/>
           <w:szCs w:val="22"/>
         </w:rPr>
-        <w:t xml:space="preserve">You notice the dashboard shows wrong numbers. Open Claude Cowork with the project folder selected and say:</w:t>
+        <w:t xml:space="preserve">You notice the dashboard shows wrong numbers. Open Claude Code with the project folder selected and say:</w:t>
       </w:r>
     </w:p>
     <w:p>
@@ -2848,7 +3126,7 @@
           <w:sz w:val="20"/>
           <w:szCs w:val="20"/>
         </w:rPr>
-        <w:t xml:space="preserve">Contact Chibuzor at conwurah@gmail.com for infrastructure issues. For dashboard bugs or features, use Claude Cowork with the project folder.</w:t>
+        <w:t xml:space="preserve">Contact Chibuzor at conwurah@gmail.com for infrastructure issues. For dashboard bugs or features, use Claude Code with the project folder.</w:t>
       </w:r>
     </w:p>
     <w:sectPr>

</xml_diff>

<commit_message>
Docs: Add 'Can Claude commit and push for me?' subsection to onboarding
Answers a new collaborator's question about committing/pushing:
- Explains commit (local) vs push (remote) — Claude can always commit;
  pushing needs repo access.
- Lists the 3 one-time requirements: accepted collaborator invite, SSH key,
  git identity.
- Clarifies that personal GitHub repos have no Read/Write dropdown — a
  collaborator gets push access automatically (that setting is org-only).
- Adds a 'permission denied' troubleshooting note.
- Applied to both ONBOARDING.md and the Word .docx.

Co-Authored-By: Claude Opus 4.8 (1M context) <noreply@anthropic.com>
</commit_message>
<xml_diff>
--- a/Seamfix Dashboard - Onboarding Guide.docx
+++ b/Seamfix Dashboard - Onboarding Guide.docx
@@ -1099,6 +1099,147 @@
           <w:szCs w:val="22"/>
         </w:rPr>
         <w:t xml:space="preserve">Claude will handle all the git commands for you.</w:t>
+      </w:r>
+    </w:p>
+    <w:p>
+      <w:pPr>
+        <w:pStyle w:val="Heading2"/>
+      </w:pPr>
+      <w:r>
+        <w:t xml:space="preserve">Can Claude commit and push for me?</w:t>
+      </w:r>
+    </w:p>
+    <w:p>
+      <w:pPr>
+        <w:spacing w:after="200"/>
+      </w:pPr>
+      <w:r>
+        <w:rPr>
+          <w:rFonts w:ascii="Arial" w:cs="Arial" w:eastAsia="Arial" w:hAnsi="Arial"/>
+          <w:sz w:val="22"/>
+          <w:szCs w:val="22"/>
+        </w:rPr>
+        <w:t xml:space="preserve">Yes — but it helps to understand there are two separate steps. Committing means saving a snapshot of your changes on your own computer; Claude can always do this. Pushing means uploading those commits up to GitHub so the live site can pick them up — that step needs you to have access to the repo.</w:t>
+      </w:r>
+    </w:p>
+    <w:p>
+      <w:pPr>
+        <w:spacing w:after="120"/>
+      </w:pPr>
+      <w:r>
+        <w:rPr>
+          <w:rFonts w:ascii="Arial" w:cs="Arial" w:eastAsia="Arial" w:hAnsi="Arial"/>
+          <w:b/>
+          <w:bCs/>
+          <w:sz w:val="22"/>
+          <w:szCs w:val="22"/>
+        </w:rPr>
+        <w:t xml:space="preserve">For pushing to work, three things must be true (all one-time setup):</w:t>
+      </w:r>
+    </w:p>
+    <w:p>
+      <w:pPr>
+        <w:spacing w:after="120"/>
+      </w:pPr>
+      <w:r>
+        <w:rPr>
+          <w:rFonts w:ascii="Arial" w:cs="Arial" w:eastAsia="Arial" w:hAnsi="Arial"/>
+          <w:b/>
+          <w:bCs/>
+          <w:sz w:val="22"/>
+          <w:szCs w:val="22"/>
+        </w:rPr>
+        <w:t xml:space="preserve">1. You’ve been added as a collaborator, and accepted the invite. </w:t>
+      </w:r>
+      <w:r>
+        <w:rPr>
+          <w:rFonts w:ascii="Arial" w:cs="Arial" w:eastAsia="Arial" w:hAnsi="Arial"/>
+          <w:sz w:val="22"/>
+          <w:szCs w:val="22"/>
+        </w:rPr>
+        <w:t xml:space="preserve">GitHub emails you an invitation — click Accept. On a personal GitHub repo like this one, being added as a collaborator automatically gives you push access; there is no separate “Read vs Write” setting to choose. (That dropdown only appears on company/organization repos.)</w:t>
+      </w:r>
+    </w:p>
+    <w:p>
+      <w:pPr>
+        <w:spacing w:after="120"/>
+      </w:pPr>
+      <w:r>
+        <w:rPr>
+          <w:rFonts w:ascii="Arial" w:cs="Arial" w:eastAsia="Arial" w:hAnsi="Arial"/>
+          <w:b/>
+          <w:bCs/>
+          <w:sz w:val="22"/>
+          <w:szCs w:val="22"/>
+        </w:rPr>
+        <w:t xml:space="preserve">2. Your SSH key is set up </w:t>
+      </w:r>
+      <w:r>
+        <w:rPr>
+          <w:rFonts w:ascii="Arial" w:cs="Arial" w:eastAsia="Arial" w:hAnsi="Arial"/>
+          <w:sz w:val="22"/>
+          <w:szCs w:val="22"/>
+        </w:rPr>
+        <w:t xml:space="preserve">(see the SSH Key Setup section). This is how your computer proves who it is to GitHub.</w:t>
+      </w:r>
+    </w:p>
+    <w:p>
+      <w:pPr>
+        <w:spacing w:after="200"/>
+      </w:pPr>
+      <w:r>
+        <w:rPr>
+          <w:rFonts w:ascii="Arial" w:cs="Arial" w:eastAsia="Arial" w:hAnsi="Arial"/>
+          <w:b/>
+          <w:bCs/>
+          <w:sz w:val="22"/>
+          <w:szCs w:val="22"/>
+        </w:rPr>
+        <w:t xml:space="preserve">3. Git knows your name and email. </w:t>
+      </w:r>
+      <w:r>
+        <w:rPr>
+          <w:rFonts w:ascii="Arial" w:cs="Arial" w:eastAsia="Arial" w:hAnsi="Arial"/>
+          <w:sz w:val="22"/>
+          <w:szCs w:val="22"/>
+        </w:rPr>
+        <w:t xml:space="preserve">If it doesn’t, git asks the first time — or just tell Claude: “Set my git name to [name] and email to [email].”</w:t>
+      </w:r>
+    </w:p>
+    <w:p>
+      <w:pPr>
+        <w:spacing w:after="200"/>
+      </w:pPr>
+      <w:r>
+        <w:rPr>
+          <w:rFonts w:ascii="Arial" w:cs="Arial" w:eastAsia="Arial" w:hAnsi="Arial"/>
+          <w:sz w:val="22"/>
+          <w:szCs w:val="22"/>
+        </w:rPr>
+        <w:t xml:space="preserve">When you ask Claude to commit and push, Claude Code will ask you to approve running the git commands. Just approve them — that’s normal and safe.</w:t>
+      </w:r>
+    </w:p>
+    <w:p>
+      <w:pPr>
+        <w:spacing w:after="200"/>
+      </w:pPr>
+      <w:r>
+        <w:rPr>
+          <w:rFonts w:ascii="Arial" w:cs="Arial" w:eastAsia="Arial" w:hAnsi="Arial"/>
+          <w:b/>
+          <w:bCs/>
+          <w:sz w:val="22"/>
+          <w:szCs w:val="22"/>
+        </w:rPr>
+        <w:t xml:space="preserve">If a push ever fails with “permission denied,” </w:t>
+      </w:r>
+      <w:r>
+        <w:rPr>
+          <w:rFonts w:ascii="Arial" w:cs="Arial" w:eastAsia="Arial" w:hAnsi="Arial"/>
+          <w:sz w:val="22"/>
+          <w:szCs w:val="22"/>
+        </w:rPr>
+        <w:t xml:space="preserve">it almost always means the collaborator invite wasn’t accepted yet, or the SSH key isn’t set up. Fix those two and it will work.</w:t>
       </w:r>
     </w:p>
     <w:p>

</xml_diff>